<commit_message>
Fix 第6稿: figure caption font size and remove 逆説的現象
- Figure caption (図. 研究フレームワーク): add sz=21 to match body 10.5pt
- 学部での成果: 「悪化するという逆説的現象を実験的に確認し」→「悪化することを実験的に確認し」

Co-Authored-By: Claude Sonnet 4.6 <noreply@anthropic.com>
</commit_message>
<xml_diff>
--- a/2027年度_研究計画書_春日裕次_第6稿.docx
+++ b/2027年度_研究計画書_春日裕次_第6稿.docx
@@ -11,6 +11,121 @@
           <w:bdr w:val="single" w:sz="4" w:space="0" w:color="auto"/>
         </w:rPr>
       </w:pPr>
+      <w:r>
+        <w:rPr>
+          <w:rFonts w:ascii="ＭＳ 明朝" w:hAnsi="ＭＳ 明朝" w:hint="eastAsia"/>
+          <w:noProof/>
+          <w:sz w:val="20"/>
+        </w:rPr>
+        <mc:AlternateContent>
+          <mc:Choice Requires="wps">
+            <w:drawing>
+              <wp:anchor distT="0" distB="0" distL="114300" distR="114300" simplePos="0" relativeHeight="251661312" behindDoc="0" locked="0" layoutInCell="1" allowOverlap="1" wp14:anchorId="37F4A3F8" wp14:editId="3F4343ED">
+                <wp:simplePos x="0" y="0"/>
+                <wp:positionH relativeFrom="column">
+                  <wp:posOffset>0</wp:posOffset>
+                </wp:positionH>
+                <wp:positionV relativeFrom="paragraph">
+                  <wp:posOffset>0</wp:posOffset>
+                </wp:positionV>
+                <wp:extent cx="2152650" cy="247650"/>
+                <wp:effectExtent l="0" t="0" r="19050" b="19050"/>
+                <wp:wrapNone/>
+                <wp:docPr id="2076881426" name="Text Box 5"/>
+                <wp:cNvGraphicFramePr>
+                  <a:graphicFrameLocks xmlns:a="http://schemas.openxmlformats.org/drawingml/2006/main"/>
+                </wp:cNvGraphicFramePr>
+                <a:graphic xmlns:a="http://schemas.openxmlformats.org/drawingml/2006/main">
+                  <a:graphicData uri="http://schemas.microsoft.com/office/word/2010/wordprocessingShape">
+                    <wps:wsp>
+                      <wps:cNvSpPr txBox="1">
+                        <a:spLocks noChangeArrowheads="1"/>
+                      </wps:cNvSpPr>
+                      <wps:spPr bwMode="auto">
+                        <a:xfrm>
+                          <a:off x="0" y="0"/>
+                          <a:ext cx="2152650" cy="247650"/>
+                        </a:xfrm>
+                        <a:prstGeom prst="rect">
+                          <a:avLst/>
+                        </a:prstGeom>
+                        <a:solidFill>
+                          <a:srgbClr val="FFFFFF"/>
+                        </a:solidFill>
+                        <a:ln w="9525">
+                          <a:solidFill>
+                            <a:srgbClr val="000000"/>
+                          </a:solidFill>
+                          <a:miter lim="800000"/>
+                          <a:headEnd/>
+                          <a:tailEnd/>
+                        </a:ln>
+                        <a:effectLst/>
+                        <a:extLst>
+                          <a:ext uri="{AF507438-7753-43e0-B8FC-AC1667EBCBE1}">
+                            <a14:hiddenEffects xmlns="" xmlns:mo="http://schemas.microsoft.com/office/mac/office/2008/main" xmlns:mv="urn:schemas-microsoft-com:mac:vml" xmlns:o="urn:schemas-microsoft-com:office:office" xmlns:v="urn:schemas-microsoft-com:vml" xmlns:w10="urn:schemas-microsoft-com:office:word" xmlns:w="http://schemas.openxmlformats.org/wordprocessingml/2006/main" xmlns:a14="http://schemas.microsoft.com/office/drawing/2010/main">
+                              <a:effectLst>
+                                <a:outerShdw blurRad="63500" dist="38099" dir="2700000" algn="ctr" rotWithShape="0">
+                                  <a:srgbClr val="000000">
+                                    <a:alpha val="74998"/>
+                                  </a:srgbClr>
+                                </a:outerShdw>
+                              </a:effectLst>
+                            </a14:hiddenEffects>
+                          </a:ext>
+                        </a:extLst>
+                      </wps:spPr>
+                      <wps:txbx>
+                        <w:txbxContent>
+                          <w:p>
+                            <w:r>
+                              <w:rPr>
+                                <w:rFonts w:hint="eastAsia"/>
+                              </w:rPr>
+                              <w:t>先端メディアサイエンス専攻用</w:t>
+                            </w:r>
+                          </w:p>
+                        </w:txbxContent>
+                      </wps:txbx>
+                      <wps:bodyPr rot="0" vert="horz" wrap="square" lIns="91440" tIns="45720" rIns="91440" bIns="45720" anchor="t" anchorCtr="0" upright="1">
+                        <a:noAutofit/>
+                      </wps:bodyPr>
+                    </wps:wsp>
+                  </a:graphicData>
+                </a:graphic>
+                <wp14:sizeRelH relativeFrom="page">
+                  <wp14:pctWidth>0</wp14:pctWidth>
+                </wp14:sizeRelH>
+                <wp14:sizeRelV relativeFrom="page">
+                  <wp14:pctHeight>0</wp14:pctHeight>
+                </wp14:sizeRelV>
+              </wp:anchor>
+            </w:drawing>
+          </mc:Choice>
+          <mc:Fallback>
+            <w:pict>
+              <v:shapetype w14:anchorId="37F4A3F8" id="_x0000_t202" coordsize="21600,21600" o:spt="202" path="m,l,21600r21600,l21600,xe">
+                <v:stroke joinstyle="miter"/>
+                <v:path gradientshapeok="t" o:connecttype="rect"/>
+              </v:shapetype>
+              <v:shape id="Text Box 5" o:spid="_x0000_s1026" type="#_x0000_t202" style="position:absolute;left:0;text-align:left;margin-left:0;margin-top:0;width:169.5pt;height:19.5pt;z-index:251661312;visibility:visible;mso-wrap-style:square;mso-width-percent:0;mso-height-percent:0;mso-wrap-distance-left:9pt;mso-wrap-distance-top:0;mso-wrap-distance-right:9pt;mso-wrap-distance-bottom:0;mso-position-horizontal:absolute;mso-position-horizontal-relative:text;mso-position-vertical:absolute;mso-position-vertical-relative:text;mso-width-percent:0;mso-height-percent:0;mso-width-relative:page;mso-height-relative:page;v-text-anchor:top" o:gfxdata="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">
+                <v:textbox>
+                  <w:txbxContent>
+                    <w:p>
+                      <w:r>
+                        <w:rPr>
+                          <w:rFonts w:hint="eastAsia"/>
+                        </w:rPr>
+                        <w:t>先端メディアサイエンス専攻用</w:t>
+                      </w:r>
+                    </w:p>
+                  </w:txbxContent>
+                </v:textbox>
+              </v:shape>
+            </w:pict>
+          </mc:Fallback>
+        </mc:AlternateContent>
+      </w:r>
       <w:r>
         <w:rPr>
           <w:rFonts w:ascii="ＭＳ 明朝" w:hAnsi="ＭＳ 明朝" w:hint="eastAsia"/>
@@ -531,13 +646,13 @@
               <w:jc w:val="center"/>
               <w:rPr>
                 <w:rFonts w:ascii="ＭＳ 明朝" w:hAnsi="ＭＳ 明朝"/>
-                <w:sz w:val="20"/>
+                <w:szCs w:val="21"/>
               </w:rPr>
             </w:pPr>
             <w:r>
               <w:rPr>
                 <w:rFonts w:ascii="ＭＳ 明朝" w:hAnsi="ＭＳ 明朝" w:hint="eastAsia"/>
-                <w:sz w:val="20"/>
+                <w:szCs w:val="21"/>
               </w:rPr>
               <w:t>春日裕次</w:t>
             </w:r>
@@ -566,13 +681,13 @@
               <w:jc w:val="center"/>
               <w:rPr>
                 <w:rFonts w:ascii="ＭＳ 明朝" w:hAnsi="ＭＳ 明朝"/>
-                <w:sz w:val="20"/>
+                <w:szCs w:val="21"/>
               </w:rPr>
             </w:pPr>
             <w:r>
               <w:rPr>
                 <w:rFonts w:ascii="ＭＳ 明朝" w:hAnsi="ＭＳ 明朝"/>
-                <w:sz w:val="20"/>
+                <w:szCs w:val="21"/>
               </w:rPr>
               <w:t>森勢将雅</w:t>
             </w:r>
@@ -635,13 +750,11 @@
               </w:rPr>
             </w:pPr>
             <w:r>
-              <w:t>・喉マイク音声に気導マイク向けの音声強調モデルを適用すると、音声品質指標（明瞭度・音質）が改善するにもかかわらず自動音声認識の文字誤り率が全</w:t>
-            </w:r>
-            <w:r>
-              <w:t>34</w:t>
-            </w:r>
-            <w:r>
-              <w:t>条件で悪化するという逆説的現象を実験的に確認し、スペクトル分析により機構を解明した。</w:t>
+              <w:rPr>
+                <w:sz w:val="21"/>
+                <w:szCs w:val="21"/>
+              </w:rPr>
+              <w:t>・喉マイク音声に気導マイク向けの音声強調モデルを適用すると、音声品質指標（明瞭度・音質）が改善するにもかかわらず自動音声認識の文字誤り率（Character error rate : CER）が全34条件で悪化することを実験的に確認し、スペクトル分析により機構を解明した。</w:t>
             </w:r>
           </w:p>
           <w:p>
@@ -653,7 +766,13 @@
               </w:rPr>
             </w:pPr>
             <w:r>
-              <w:t>・自動音声認識モデルを喉マイク音声でファインチューニングすることで文字誤り率が</w:t>
+              <w:t>・自動音声認識モデルを喉マイク音声でファインチューニングすることで</w:t>
+            </w:r>
+            <w:r>
+              <w:t>CER</w:t>
+            </w:r>
+            <w:r>
+              <w:t>が</w:t>
             </w:r>
             <w:r>
               <w:t>72%</w:t>
@@ -761,7 +880,25 @@
               <w:t>[1][2]</w:t>
             </w:r>
             <w:r>
-              <w:t>では音声強調による音声品質の改善が認識精度向上に直結しないことが報告されている。喉マイクにおいて同様の現象が生じるか、またどちらのアプローチがより有効か、さらになぜそのような効果差が生じるかを体系的に明らかにし、その知見から喉マイク向け音声処理の設計原則を導出することが本研究の目的である。</w:t>
+              <w:t>では音声強調による音声品質の改善が認識精度向上に直結しないことが報告されている。</w:t>
+            </w:r>
+            <w:r>
+              <w:rPr>
+                <w:rFonts w:hint="eastAsia"/>
+              </w:rPr>
+              <w:t>そこで、本研究では、</w:t>
+            </w:r>
+            <w:r>
+              <w:t>喉マイクにおいて同様の現象が生じるか、またどちらのアプローチがより有効か</w:t>
+            </w:r>
+            <w:r>
+              <w:rPr>
+                <w:rFonts w:hint="eastAsia"/>
+              </w:rPr>
+              <w:t>を検証する。</w:t>
+            </w:r>
+            <w:r>
+              <w:t>さらになぜそのような効果差が生じるかを体系的に明らかにし、その知見から喉マイク向け音声処理の設計原則を導出する。</w:t>
             </w:r>
           </w:p>
           <w:p>
@@ -869,7 +1006,27 @@
               <w:rPr>
                 <w:szCs w:val="21"/>
               </w:rPr>
-              <w:t>による音声認識実験を行った。気導マイク向けモデルを適用した全</w:t>
+              <w:t>による音声認識実験を行った。</w:t>
+            </w:r>
+            <w:r>
+              <w:rPr>
+                <w:rFonts w:hint="eastAsia"/>
+                <w:szCs w:val="21"/>
+              </w:rPr>
+              <w:t>その結果、</w:t>
+            </w:r>
+            <w:r>
+              <w:rPr>
+                <w:rFonts w:hint="eastAsia"/>
+                <w:szCs w:val="21"/>
+              </w:rPr>
+              <w:t>気</w:t>
+            </w:r>
+            <w:r>
+              <w:rPr>
+                <w:szCs w:val="21"/>
+              </w:rPr>
+              <w:t>導マイク向けモデルを適用した全</w:t>
             </w:r>
             <w:r>
               <w:rPr>
@@ -881,7 +1038,20 @@
               <w:rPr>
                 <w:szCs w:val="21"/>
               </w:rPr>
-              <w:t>条件で文字誤り率が悪化することを確認した。スペクトル分析により、モデルがフォルマント帯域のエネルギーを削減し低域にアーティファクトを付加していることを実測した。別途、喉マイク音声で学習されたドメイン適合型モデル（</w:t>
+              <w:t>条件で文字誤り率が悪化することを確認した。</w:t>
+            </w:r>
+            <w:r>
+              <w:rPr>
+                <w:rFonts w:hint="eastAsia"/>
+                <w:szCs w:val="21"/>
+              </w:rPr>
+              <w:t>さらに、</w:t>
+            </w:r>
+            <w:r>
+              <w:rPr>
+                <w:szCs w:val="21"/>
+              </w:rPr>
+              <w:t>スペクトル分析により、モデルがフォルマント帯域のエネルギーを削減し低域にアーティファクトを付加していることを実測した。別途、喉マイク音声で学習されたドメイン適合型モデル（</w:t>
             </w:r>
             <w:r>
               <w:rPr>
@@ -917,7 +1087,13 @@
               <w:rPr>
                 <w:szCs w:val="21"/>
               </w:rPr>
-              <w:t>）との比較では、改善が見られた（文字誤り率</w:t>
+              <w:t>）との比較では、改善が見られた（</w:t>
+            </w:r>
+            <w:r>
+              <w:rPr>
+                <w:szCs w:val="21"/>
+              </w:rPr>
+              <w:t>CER</w:t>
             </w:r>
             <w:r>
               <w:rPr>
@@ -1074,7 +1250,13 @@
                 <w:szCs w:val="21"/>
               </w:rPr>
               <w:lastRenderedPageBreak/>
-              <w:t>学部での予備実験を通じて、喉マイク向け音声強調と自動音声認識モデル適応を同一評価指標・同一テストセット上で比較した結果、適切なドメインの音声強調であっても認識精度の改善には上限があり、ファインチューニング単体の精度（文字誤り率</w:t>
+              <w:t>学部での予備実験を通じて、喉マイク向け音声強調と自動音声認識モデル適応を同一評価指標・同一テストセット上で比較した結果、適切なドメインの音声強調であっても認識精度の改善には上限があり、ファインチューニング単体の精度（</w:t>
+            </w:r>
+            <w:r>
+              <w:rPr>
+                <w:szCs w:val="21"/>
+              </w:rPr>
+              <w:t>CER</w:t>
             </w:r>
             <w:r>
               <w:rPr>
@@ -1157,15 +1339,28 @@
                 <w:bCs/>
                 <w:iCs/>
                 <w:szCs w:val="21"/>
-              </w:rPr>
-            </w:pPr>
-            <w:r>
+                <w:sz w:val="21"/>
+              </w:rPr>
+            </w:pPr>
+            <w:r>
+              <w:rPr>
+                <w:sz w:val="21"/>
+                <w:szCs w:val="21"/>
+              </w:rPr>
               <w:t>図</w:t>
             </w:r>
             <w:r>
+              <w:rPr>
+                <w:sz w:val="21"/>
+                <w:szCs w:val="21"/>
+              </w:rPr>
               <w:t xml:space="preserve">. </w:t>
             </w:r>
             <w:r>
+              <w:rPr>
+                <w:sz w:val="21"/>
+                <w:szCs w:val="21"/>
+              </w:rPr>
               <w:t>研究フレームワーク</w:t>
             </w:r>
           </w:p>
@@ -1199,7 +1394,7 @@
               <w:t>——</w:t>
             </w:r>
             <w:r>
-              <w:t>が喉マイク音声認識の実用化における核心的課題として残される。</w:t>
+              <w:t>が喉マイク音声認識の実用化における課題として残される。</w:t>
             </w:r>
           </w:p>
           <w:p>
@@ -1278,15 +1473,43 @@
             </w:r>
             <w:r>
               <w:rPr>
-                <w:szCs w:val="21"/>
-              </w:rPr>
-              <w:t>ASR</w:t>
-            </w:r>
-            <w:r>
-              <w:rPr>
-                <w:szCs w:val="21"/>
-              </w:rPr>
-              <w:t>損失を直接最適化するモデル適応が認識精度改善に有効であるという原則</w:t>
+                <w:rFonts w:hint="eastAsia"/>
+                <w:szCs w:val="21"/>
+              </w:rPr>
+              <w:t>自動</w:t>
+            </w:r>
+            <w:r>
+              <w:rPr>
+                <w:rFonts w:hint="eastAsia"/>
+                <w:szCs w:val="21"/>
+              </w:rPr>
+              <w:t>音声認識</w:t>
+            </w:r>
+            <w:r>
+              <w:rPr>
+                <w:rFonts w:hint="eastAsia"/>
+                <w:szCs w:val="21"/>
+              </w:rPr>
+              <w:t>における</w:t>
+            </w:r>
+            <w:r>
+              <w:rPr>
+                <w:szCs w:val="21"/>
+              </w:rPr>
+              <w:t>損失</w:t>
+            </w:r>
+            <w:r>
+              <w:rPr>
+                <w:rFonts w:hint="eastAsia"/>
+                <w:szCs w:val="21"/>
+              </w:rPr>
+              <w:t>関数</w:t>
+            </w:r>
+            <w:r>
+              <w:rPr>
+                <w:szCs w:val="21"/>
+              </w:rPr>
+              <w:t>を直接最適化するモデル適応が認識精度改善に有効であるという原則</w:t>
             </w:r>
             <w:r>
               <w:rPr>
@@ -1298,7 +1521,7 @@
               <w:rPr>
                 <w:szCs w:val="21"/>
               </w:rPr>
-              <w:t>を明示するとともに、モデル適応のペアデータ依存性という実用化の核心的課題を特定する。</w:t>
+              <w:t>を明示するとともに、モデル適応のペアデータ依存性という実用化の課題を特定する。</w:t>
             </w:r>
           </w:p>
           <w:p>
@@ -1511,14 +1734,14 @@
                         <a:effectLst/>
                         <a:extLst>
                           <a:ext uri="{909E8E84-426E-40dd-AFC4-6F175D3DCCD1}">
-                            <a14:hiddenFill xmlns="" xmlns:mo="http://schemas.microsoft.com/office/mac/office/2008/main" xmlns:mv="urn:schemas-microsoft-com:mac:vml" xmlns:o="urn:schemas-microsoft-com:office:office" xmlns:v="urn:schemas-microsoft-com:vml" xmlns:w10="urn:schemas-microsoft-com:office:word" xmlns:w="http://schemas.openxmlformats.org/wordprocessingml/2006/main" xmlns:a14="http://schemas.microsoft.com/office/drawing/2010/main">
+                            <a14:hiddenFill xmlns:a14="http://schemas.microsoft.com/office/drawing/2010/main" xmlns:w="http://schemas.openxmlformats.org/wordprocessingml/2006/main" xmlns:w10="urn:schemas-microsoft-com:office:word" xmlns:v="urn:schemas-microsoft-com:vml" xmlns:o="urn:schemas-microsoft-com:office:office" xmlns:mv="urn:schemas-microsoft-com:mac:vml" xmlns:mo="http://schemas.microsoft.com/office/mac/office/2008/main" xmlns="">
                               <a:solidFill>
                                 <a:srgbClr val="FFFFFF"/>
                               </a:solidFill>
                             </a14:hiddenFill>
                           </a:ext>
                           <a:ext uri="{91240B29-F687-4f45-9708-019B960494DF}">
-                            <a14:hiddenLine xmlns="" xmlns:mo="http://schemas.microsoft.com/office/mac/office/2008/main" xmlns:mv="urn:schemas-microsoft-com:mac:vml" xmlns:o="urn:schemas-microsoft-com:office:office" xmlns:v="urn:schemas-microsoft-com:vml" xmlns:w10="urn:schemas-microsoft-com:office:word" xmlns:w="http://schemas.openxmlformats.org/wordprocessingml/2006/main" xmlns:a14="http://schemas.microsoft.com/office/drawing/2010/main" w="9525">
+                            <a14:hiddenLine xmlns:a14="http://schemas.microsoft.com/office/drawing/2010/main" xmlns:w="http://schemas.openxmlformats.org/wordprocessingml/2006/main" xmlns:w10="urn:schemas-microsoft-com:office:word" xmlns:v="urn:schemas-microsoft-com:vml" xmlns:o="urn:schemas-microsoft-com:office:office" xmlns:mv="urn:schemas-microsoft-com:mac:vml" xmlns:mo="http://schemas.microsoft.com/office/mac/office/2008/main" xmlns="" w="9525">
                               <a:solidFill>
                                 <a:srgbClr val="000000"/>
                               </a:solidFill>
@@ -1528,7 +1751,7 @@
                             </a14:hiddenLine>
                           </a:ext>
                           <a:ext uri="{AF507438-7753-43e0-B8FC-AC1667EBCBE1}">
-                            <a14:hiddenEffects xmlns="" xmlns:mo="http://schemas.microsoft.com/office/mac/office/2008/main" xmlns:mv="urn:schemas-microsoft-com:mac:vml" xmlns:o="urn:schemas-microsoft-com:office:office" xmlns:v="urn:schemas-microsoft-com:vml" xmlns:w10="urn:schemas-microsoft-com:office:word" xmlns:w="http://schemas.openxmlformats.org/wordprocessingml/2006/main" xmlns:a14="http://schemas.microsoft.com/office/drawing/2010/main">
+                            <a14:hiddenEffects xmlns:a14="http://schemas.microsoft.com/office/drawing/2010/main" xmlns:w="http://schemas.openxmlformats.org/wordprocessingml/2006/main" xmlns:w10="urn:schemas-microsoft-com:office:word" xmlns:v="urn:schemas-microsoft-com:vml" xmlns:o="urn:schemas-microsoft-com:office:office" xmlns:mv="urn:schemas-microsoft-com:mac:vml" xmlns:mo="http://schemas.microsoft.com/office/mac/office/2008/main" xmlns="">
                               <a:effectLst>
                                 <a:outerShdw blurRad="63500" dist="38099" dir="2700000" algn="ctr" rotWithShape="0">
                                   <a:srgbClr val="000000">

</xml_diff>

<commit_message>
Script 67: flatten SE outputs before fusion
Co-Authored-By: Claude Opus 5.5 (1M context) <noreply@anthropic.com>
</commit_message>
<xml_diff>
--- a/2027年度_研究計画書_春日裕次_第6稿.docx
+++ b/2027年度_研究計画書_春日裕次_第6稿.docx
@@ -63,7 +63,7 @@
                         <a:effectLst/>
                         <a:extLst>
                           <a:ext uri="{AF507438-7753-43e0-B8FC-AC1667EBCBE1}">
-                            <a14:hiddenEffects xmlns="" xmlns:mo="http://schemas.microsoft.com/office/mac/office/2008/main" xmlns:mv="urn:schemas-microsoft-com:mac:vml" xmlns:o="urn:schemas-microsoft-com:office:office" xmlns:v="urn:schemas-microsoft-com:vml" xmlns:w10="urn:schemas-microsoft-com:office:word" xmlns:w="http://schemas.openxmlformats.org/wordprocessingml/2006/main" xmlns:a14="http://schemas.microsoft.com/office/drawing/2010/main">
+                            <a14:hiddenEffects xmlns:a14="http://schemas.microsoft.com/office/drawing/2010/main" xmlns:w="http://schemas.openxmlformats.org/wordprocessingml/2006/main" xmlns:w10="urn:schemas-microsoft-com:office:word" xmlns:v="urn:schemas-microsoft-com:vml" xmlns:o="urn:schemas-microsoft-com:office:office" xmlns:mv="urn:schemas-microsoft-com:mac:vml" xmlns:mo="http://schemas.microsoft.com/office/mac/office/2008/main" xmlns="">
                               <a:effectLst>
                                 <a:outerShdw blurRad="63500" dist="38099" dir="2700000" algn="ctr" rotWithShape="0">
                                   <a:srgbClr val="000000">
@@ -751,10 +751,33 @@
             </w:pPr>
             <w:r>
               <w:rPr>
-                <w:sz w:val="21"/>
-                <w:szCs w:val="21"/>
-              </w:rPr>
-              <w:t>・喉マイク音声に気導マイク向けの音声強調モデルを適用すると、音声品質指標（明瞭度・音質）が改善するにもかかわらず自動音声認識の文字誤り率（Character error rate : CER）が全34条件で悪化することを実験的に確認し、スペクトル分析により機構を解明した。</w:t>
+                <w:szCs w:val="21"/>
+              </w:rPr>
+              <w:t>・喉マイク音声に気導マイク向けの音声強調モデルを適用すると，音声品質指標（明瞭度・音質）が改善するにもかかわらず自動音声認識の文字誤り率（</w:t>
+            </w:r>
+            <w:r>
+              <w:rPr>
+                <w:szCs w:val="21"/>
+              </w:rPr>
+              <w:t>character error rate; CER</w:t>
+            </w:r>
+            <w:r>
+              <w:rPr>
+                <w:szCs w:val="21"/>
+              </w:rPr>
+              <w:t>）が全</w:t>
+            </w:r>
+            <w:r>
+              <w:rPr>
+                <w:szCs w:val="21"/>
+              </w:rPr>
+              <w:t>34</w:t>
+            </w:r>
+            <w:r>
+              <w:rPr>
+                <w:szCs w:val="21"/>
+              </w:rPr>
+              <w:t>条件で悪化することを実験的に確認し，スペクトル分析により機構を解明した．</w:t>
             </w:r>
           </w:p>
           <w:p>
@@ -766,25 +789,46 @@
               </w:rPr>
             </w:pPr>
             <w:r>
+              <w:rPr>
+                <w:szCs w:val="21"/>
+              </w:rPr>
               <w:t>・自動音声認識モデルを喉マイク音声でファインチューニングすることで</w:t>
             </w:r>
             <w:r>
+              <w:rPr>
+                <w:szCs w:val="21"/>
+              </w:rPr>
               <w:t>CER</w:t>
             </w:r>
             <w:r>
+              <w:rPr>
+                <w:szCs w:val="21"/>
+              </w:rPr>
               <w:t>が</w:t>
             </w:r>
             <w:r>
+              <w:rPr>
+                <w:szCs w:val="21"/>
+              </w:rPr>
               <w:t>72%</w:t>
             </w:r>
             <w:r>
-              <w:t>改善すること、また全パラメータの</w:t>
-            </w:r>
-            <w:r>
+              <w:rPr>
+                <w:szCs w:val="21"/>
+              </w:rPr>
+              <w:t>改善すること，また全パラメータの</w:t>
+            </w:r>
+            <w:r>
+              <w:rPr>
+                <w:szCs w:val="21"/>
+              </w:rPr>
               <w:t>0.5%</w:t>
             </w:r>
             <w:r>
-              <w:t>のみを学習する軽量適応手法でも同等の精度が達成できることを実験的に示した。</w:t>
+              <w:rPr>
+                <w:szCs w:val="21"/>
+              </w:rPr>
+              <w:t>のみを学習する軽量適応手法でも同等の精度が達成できることを実験的に示した．</w:t>
             </w:r>
           </w:p>
           <w:p>
@@ -862,43 +906,46 @@
               </w:rPr>
             </w:pPr>
             <w:r>
-              <w:t>骨伝導マイクとも呼ばれる喉マイクは、外部騒音を構造的に遮断できるため軍・警察・消防など気導マイクが使用不能な高騒音環境での音声通信に活用されている。一方、骨伝導経路の物理的特性により</w:t>
-            </w:r>
-            <w:r>
+              <w:rPr>
+                <w:szCs w:val="21"/>
+              </w:rPr>
+              <w:t>骨伝導マイクとも呼ばれる喉マイクは，外部騒音を構造的に遮断できるため軍・警察・消防など気導マイクが使用不能な高騒音環境での音声通信に活用されている．一方，骨伝導経路の物理的特性により</w:t>
+            </w:r>
+            <w:r>
+              <w:rPr>
+                <w:szCs w:val="21"/>
+              </w:rPr>
               <w:t>2</w:t>
             </w:r>
             <w:r>
+              <w:rPr>
+                <w:szCs w:val="21"/>
+              </w:rPr>
               <w:t>〜</w:t>
             </w:r>
             <w:r>
+              <w:rPr>
+                <w:szCs w:val="21"/>
+              </w:rPr>
               <w:t>3 kHz</w:t>
             </w:r>
             <w:r>
-              <w:t>以上の高周波成分が大幅に減衰するため、気導マイク音声を前提とした汎用の自動音声認識モデルでは認識精度が著しく低下するという課題がある。この問題への対処として「音声強調パイプライン」と「自動音声認識モデル適応」の二つのアプローチが存在するが、気導マイクを対象とした先行研究</w:t>
-            </w:r>
-            <w:r>
+              <w:rPr>
+                <w:szCs w:val="21"/>
+              </w:rPr>
+              <w:t>以上の高周波成分が大幅に減衰するため，気導マイク音声を前提とした汎用の自動音声認識モデルでは認識精度が著しく低下するという課題がある．この問題への対処として「音声強調パイプライン」と「自動音声認識モデル適応」の二つのアプローチが存在するが，気導マイクを対象とした先行研究</w:t>
+            </w:r>
+            <w:r>
+              <w:rPr>
+                <w:szCs w:val="21"/>
+              </w:rPr>
               <w:t>[1][2]</w:t>
             </w:r>
             <w:r>
-              <w:t>では音声強調による音声品質の改善が認識精度向上に直結しないことが報告されている。</w:t>
-            </w:r>
-            <w:r>
-              <w:rPr>
-                <w:rFonts w:hint="eastAsia"/>
-              </w:rPr>
-              <w:t>そこで、本研究では、</w:t>
-            </w:r>
-            <w:r>
-              <w:t>喉マイクにおいて同様の現象が生じるか、またどちらのアプローチがより有効か</w:t>
-            </w:r>
-            <w:r>
-              <w:rPr>
-                <w:rFonts w:hint="eastAsia"/>
-              </w:rPr>
-              <w:t>を検証する。</w:t>
-            </w:r>
-            <w:r>
-              <w:t>さらになぜそのような効果差が生じるかを体系的に明らかにし、その知見から喉マイク向け音声処理の設計原則を導出する。</w:t>
+              <w:rPr>
+                <w:szCs w:val="21"/>
+              </w:rPr>
+              <w:t>では音声強調による音声品質の改善が認識精度向上に直結しないことが報告されている．そこで，本研究では，喉マイクにおいて同様の現象が生じるか，またどちらのアプローチがより有効かを検証する．さらになぜそのような効果差が生じるかを体系的に明らかにし，その知見から喉マイク向け音声処理の設計原則を導出する．</w:t>
             </w:r>
           </w:p>
           <w:p>
@@ -964,13 +1011,13 @@
               <w:rPr>
                 <w:szCs w:val="21"/>
               </w:rPr>
-              <w:t>TAPS[3]</w:t>
-            </w:r>
-            <w:r>
-              <w:rPr>
-                <w:szCs w:val="21"/>
-              </w:rPr>
-              <w:t>のテストセットに対し、デジタル信号処理に基づくフィルタリングおよび気導マイク向けニューラルネットワーク型音声強調モデル</w:t>
+              <w:t>TAPS (Throat and Acoustic Pairing Speech) [3]</w:t>
+            </w:r>
+            <w:r>
+              <w:rPr>
+                <w:szCs w:val="21"/>
+              </w:rPr>
+              <w:t>のテストセットに対し，デジタル信号処理に基づくフィルタリングおよび気導マイク向けニューラルネットワーク型音声強調モデル</w:t>
             </w:r>
             <w:r>
               <w:rPr>
@@ -994,64 +1041,75 @@
               <w:rPr>
                 <w:szCs w:val="21"/>
               </w:rPr>
-              <w:t>条件で適用し、</w:t>
-            </w:r>
-            <w:r>
-              <w:rPr>
-                <w:szCs w:val="21"/>
-              </w:rPr>
-              <w:t>Whisper[4]</w:t>
-            </w:r>
-            <w:r>
-              <w:rPr>
-                <w:szCs w:val="21"/>
-              </w:rPr>
-              <w:t>による音声認識実験を行った。</w:t>
+              <w:t>条件で適用し，</w:t>
+            </w:r>
+            <w:r>
+              <w:rPr>
+                <w:szCs w:val="21"/>
+              </w:rPr>
+              <w:t>Whisper [4]</w:t>
+            </w:r>
+            <w:r>
+              <w:rPr>
+                <w:szCs w:val="21"/>
+              </w:rPr>
+              <w:t>による音声認識実験を行った．</w:t>
             </w:r>
             <w:r>
               <w:rPr>
                 <w:rFonts w:hint="eastAsia"/>
                 <w:szCs w:val="21"/>
               </w:rPr>
-              <w:t>その結果、</w:t>
+              <w:t>その結果</w:t>
+            </w:r>
+            <w:r>
+              <w:rPr>
+                <w:szCs w:val="21"/>
+              </w:rPr>
+              <w:t xml:space="preserve">, </w:t>
+            </w:r>
+            <w:r>
+              <w:rPr>
+                <w:szCs w:val="21"/>
+              </w:rPr>
+              <w:t>気導マイク向けモデルを適用した全</w:t>
+            </w:r>
+            <w:r>
+              <w:rPr>
+                <w:szCs w:val="21"/>
+              </w:rPr>
+              <w:t>34</w:t>
+            </w:r>
+            <w:r>
+              <w:rPr>
+                <w:szCs w:val="21"/>
+              </w:rPr>
+              <w:t>条件で</w:t>
+            </w:r>
+            <w:r>
+              <w:rPr>
+                <w:szCs w:val="21"/>
+              </w:rPr>
+              <w:t>CER</w:t>
+            </w:r>
+            <w:r>
+              <w:rPr>
+                <w:szCs w:val="21"/>
+              </w:rPr>
+              <w:t>が悪化することを確認した．</w:t>
             </w:r>
             <w:r>
               <w:rPr>
                 <w:rFonts w:hint="eastAsia"/>
                 <w:szCs w:val="21"/>
               </w:rPr>
-              <w:t>気</w:t>
-            </w:r>
-            <w:r>
-              <w:rPr>
-                <w:szCs w:val="21"/>
-              </w:rPr>
-              <w:t>導マイク向けモデルを適用した全</w:t>
-            </w:r>
-            <w:r>
-              <w:rPr>
-                <w:szCs w:val="21"/>
-              </w:rPr>
-              <w:t>34</w:t>
-            </w:r>
-            <w:r>
-              <w:rPr>
-                <w:szCs w:val="21"/>
-              </w:rPr>
-              <w:t>条件で文字誤り率が悪化することを確認した。</w:t>
-            </w:r>
-            <w:r>
-              <w:rPr>
-                <w:rFonts w:hint="eastAsia"/>
-                <w:szCs w:val="21"/>
-              </w:rPr>
               <w:t>さらに、</w:t>
             </w:r>
             <w:r>
               <w:rPr>
                 <w:szCs w:val="21"/>
               </w:rPr>
-              <w:t>スペクトル分析により、モデルがフォルマント帯域のエネルギーを削減し低域にアーティファクトを付加していることを実測した。別途、喉マイク音声で学習されたドメイン適合型モデル（</w:t>
+              <w:t>スペクトル分析により，モデルがフォルマント帯域のエネルギーを削減し低域にアーティファクトを付加していることを実測した．別途，喉マイク音声で学習されたドメイン適合型モデル（</w:t>
             </w:r>
             <w:r>
               <w:rPr>
@@ -1069,55 +1127,25 @@
               <w:rPr>
                 <w:szCs w:val="21"/>
               </w:rPr>
-              <w:t>[</w:t>
-            </w:r>
-            <w:r>
-              <w:rPr>
-                <w:szCs w:val="21"/>
-              </w:rPr>
-              <w:t>3</w:t>
-            </w:r>
-            <w:r>
-              <w:rPr>
-                <w:szCs w:val="21"/>
-              </w:rPr>
-              <w:t>]</w:t>
-            </w:r>
-            <w:r>
-              <w:rPr>
-                <w:szCs w:val="21"/>
-              </w:rPr>
-              <w:t>）との比較では、改善が見られた（</w:t>
-            </w:r>
-            <w:r>
-              <w:rPr>
-                <w:szCs w:val="21"/>
-              </w:rPr>
-              <w:t>CER</w:t>
-            </w:r>
-            <w:r>
-              <w:rPr>
-                <w:szCs w:val="21"/>
-              </w:rPr>
-              <w:t xml:space="preserve"> 0.47→0.25</w:t>
-            </w:r>
-            <w:r>
-              <w:rPr>
-                <w:szCs w:val="21"/>
-              </w:rPr>
-              <w:t>）ものの、ファインチューニング単体（</w:t>
-            </w:r>
-            <w:r>
-              <w:rPr>
-                <w:szCs w:val="21"/>
-              </w:rPr>
-              <w:t>0.15</w:t>
-            </w:r>
-            <w:r>
-              <w:rPr>
-                <w:szCs w:val="21"/>
-              </w:rPr>
-              <w:t>）には届かず、ドメイン適合型音声強調にも本質的な上限があることを確認した。</w:t>
+              <w:t xml:space="preserve"> [3]</w:t>
+            </w:r>
+            <w:r>
+              <w:rPr>
+                <w:szCs w:val="21"/>
+              </w:rPr>
+              <w:t>）との比較では，改善が見られた（</w:t>
+            </w:r>
+            <w:r>
+              <w:rPr>
+                <w:szCs w:val="21"/>
+              </w:rPr>
+              <w:t>CER 0.47→0.25</w:t>
+            </w:r>
+            <w:r>
+              <w:rPr>
+                <w:szCs w:val="21"/>
+              </w:rPr>
+              <w:t>）ものの，依然として上限があることを確認した．</w:t>
             </w:r>
           </w:p>
           <w:p>
@@ -1150,13 +1178,25 @@
               <w:rPr>
                 <w:szCs w:val="21"/>
               </w:rPr>
-              <w:t>Whisper small[4]</w:t>
-            </w:r>
-            <w:r>
-              <w:rPr>
-                <w:szCs w:val="21"/>
-              </w:rPr>
-              <w:t>を喉マイク音声でファインチューニングすることで文字誤り率が</w:t>
+              <w:t>Whisper small [4]</w:t>
+            </w:r>
+            <w:r>
+              <w:rPr>
+                <w:szCs w:val="21"/>
+              </w:rPr>
+              <w:t>を喉マイク音声でファインチューニングすることで</w:t>
+            </w:r>
+            <w:r>
+              <w:rPr>
+                <w:szCs w:val="21"/>
+              </w:rPr>
+              <w:t>CER</w:t>
+            </w:r>
+            <w:r>
+              <w:rPr>
+                <w:szCs w:val="21"/>
+              </w:rPr>
+              <w:t>が</w:t>
             </w:r>
             <w:r>
               <w:rPr>
@@ -1180,7 +1220,7 @@
               <w:rPr>
                 <w:szCs w:val="21"/>
               </w:rPr>
-              <w:t>）。また全パラメータの</w:t>
+              <w:t>）．また全パラメータの</w:t>
             </w:r>
             <w:r>
               <w:rPr>
@@ -1198,7 +1238,7 @@
               <w:rPr>
                 <w:szCs w:val="21"/>
               </w:rPr>
-              <w:t>Encoder-only Adapter[5]</w:t>
+              <w:t>Encoder-only Adapter [5]</w:t>
             </w:r>
             <w:r>
               <w:rPr>
@@ -1216,7 +1256,7 @@
               <w:rPr>
                 <w:szCs w:val="21"/>
               </w:rPr>
-              <w:t>）を達成し、軽量適応手法の有効性を確認した。</w:t>
+              <w:t>）を達成し，軽量適応手法の有効性を確認した．</w:t>
             </w:r>
           </w:p>
           <w:p>
@@ -1249,39 +1289,26 @@
               <w:rPr>
                 <w:szCs w:val="21"/>
               </w:rPr>
+              <w:t>学部での予備実験を通じて，喉マイク向け音声強調と自動音声認識モデル適応を同一評価指標・同一</w:t>
+            </w:r>
+            <w:r>
+              <w:rPr>
+                <w:szCs w:val="21"/>
+              </w:rPr>
               <w:lastRenderedPageBreak/>
-              <w:t>学部での予備実験を通じて、喉マイク向け音声強調と自動音声認識モデル適応を同一評価指標・同一テストセット上で比較した結果、適切なドメインの音声強調であっても認識精度の改善には上限があり、ファインチューニング単体の精度（</w:t>
-            </w:r>
-            <w:r>
-              <w:rPr>
-                <w:szCs w:val="21"/>
-              </w:rPr>
-              <w:t>CER</w:t>
-            </w:r>
-            <w:r>
-              <w:rPr>
-                <w:szCs w:val="21"/>
-              </w:rPr>
-              <w:t xml:space="preserve"> 0.15</w:t>
-            </w:r>
-            <w:r>
-              <w:rPr>
-                <w:szCs w:val="21"/>
-              </w:rPr>
-              <w:t>）が最良となることを定量的に確認した。</w:t>
-            </w:r>
-            <w:r>
-              <w:rPr>
-                <w:rFonts w:hint="eastAsia"/>
-                <w:szCs w:val="21"/>
-              </w:rPr>
-              <w:t>本研究</w:t>
-            </w:r>
-            <w:r>
-              <w:rPr>
-                <w:szCs w:val="21"/>
-              </w:rPr>
-              <w:t>では、この比較とスペクトル分析による効果差の機構解明をあわせ、喉マイク向け音声処理の設計原則として論文にまとめることを計画している。</w:t>
+              <w:t>テストセット上で比較した結果，適切なドメインの音声強調であっても認識精度の改善には上限があり，ファインチューニング単体の精度（</w:t>
+            </w:r>
+            <w:r>
+              <w:rPr>
+                <w:szCs w:val="21"/>
+              </w:rPr>
+              <w:t>CER 0.15</w:t>
+            </w:r>
+            <w:r>
+              <w:rPr>
+                <w:szCs w:val="21"/>
+              </w:rPr>
+              <w:t>）が最良となることを定量的に確認した．本研究では，この比較とスペクトル分析による効果差の機構解明をあわせ，喉マイク向け音声処理の設計原則として論文にまとめることを計画している．</w:t>
             </w:r>
           </w:p>
           <w:p>
@@ -1294,10 +1321,10 @@
                 <w:noProof/>
               </w:rPr>
               <w:drawing>
-                <wp:inline distT="0" distB="0" distL="0" distR="0" wp14:anchorId="2D750396" wp14:editId="7D176049">
-                  <wp:extent cx="3931920" cy="2551336"/>
+                <wp:inline distT="0" distB="0" distL="0" distR="0" wp14:anchorId="79AB1F33" wp14:editId="34D8DA52">
+                  <wp:extent cx="4389120" cy="2861715"/>
                   <wp:effectExtent l="0" t="0" r="0" b="0"/>
-                  <wp:docPr id="4" name="Picture 4"/>
+                  <wp:docPr id="2076881427" name="Picture 2076881427"/>
                   <wp:cNvGraphicFramePr>
                     <a:graphicFrameLocks xmlns:a="http://schemas.openxmlformats.org/drawingml/2006/main" noChangeAspect="1"/>
                   </wp:cNvGraphicFramePr>
@@ -1317,7 +1344,7 @@
                         <pic:spPr>
                           <a:xfrm>
                             <a:off x="0" y="0"/>
-                            <a:ext cx="3931920" cy="2551336"/>
+                            <a:ext cx="4389120" cy="2861715"/>
                           </a:xfrm>
                           <a:prstGeom prst="rect">
                             <a:avLst/>
@@ -1339,26 +1366,22 @@
                 <w:bCs/>
                 <w:iCs/>
                 <w:szCs w:val="21"/>
-                <w:sz w:val="21"/>
-              </w:rPr>
-            </w:pPr>
-            <w:r>
-              <w:rPr>
-                <w:sz w:val="21"/>
+              </w:rPr>
+            </w:pPr>
+            <w:r>
+              <w:rPr>
                 <w:szCs w:val="21"/>
               </w:rPr>
               <w:t>図</w:t>
             </w:r>
             <w:r>
               <w:rPr>
-                <w:sz w:val="21"/>
                 <w:szCs w:val="21"/>
               </w:rPr>
               <w:t xml:space="preserve">. </w:t>
             </w:r>
             <w:r>
               <w:rPr>
-                <w:sz w:val="21"/>
                 <w:szCs w:val="21"/>
               </w:rPr>
               <w:t>研究フレームワーク</w:t>
@@ -1382,19 +1405,22 @@
               </w:rPr>
             </w:pPr>
             <w:r>
-              <w:t>上記の比較・分析を通じて、モデル適応の有効性が喉マイク音声とテキストのペアデータを前提とすることが浮き彫りになる。高騒音現場など収録が困難な実環境では、このペアデータの取得自体が実用化への障壁となる。この制約の緩和</w:t>
-            </w:r>
-            <w:r>
-              <w:t>——</w:t>
-            </w:r>
-            <w:r>
-              <w:t>すなわち少量データまたはラベルなし音声での効果的な適応</w:t>
-            </w:r>
-            <w:r>
-              <w:t>——</w:t>
-            </w:r>
-            <w:r>
-              <w:t>が喉マイク音声認識の実用化における課題として残される。</w:t>
+              <w:rPr>
+                <w:szCs w:val="21"/>
+              </w:rPr>
+              <w:t>上記の比較・分析を通じて，モデル適応の有効性が喉マイク音声とテキストのペアデータを前提とすることが浮き彫りになる．高騒音現場など収録が困難な実環境では，このペアデータの取得自体が実用化への障壁となる．この制約の緩和</w:t>
+            </w:r>
+            <w:r>
+              <w:rPr>
+                <w:szCs w:val="21"/>
+              </w:rPr>
+              <w:t xml:space="preserve">, </w:t>
+            </w:r>
+            <w:r>
+              <w:rPr>
+                <w:szCs w:val="21"/>
+              </w:rPr>
+              <w:t>すなわち少量データまたはラベルなし音声での効果的な適応が喉マイク音声認識の実用化における課題として残される．</w:t>
             </w:r>
           </w:p>
           <w:p>
@@ -1421,7 +1447,7 @@
               <w:rPr>
                 <w:szCs w:val="21"/>
               </w:rPr>
-              <w:t>点の学術的貢献が期待される。</w:t>
+              <w:t>点の学術的貢献が期待される．</w:t>
             </w:r>
             <w:r>
               <w:rPr>
@@ -1433,7 +1459,7 @@
               <w:rPr>
                 <w:szCs w:val="21"/>
               </w:rPr>
-              <w:t>音声強調パイプラインと自動音声認識モデル適応を同一評価指標・同一テストセット上で比較し、喉マイクの自動音声認識における各アプローチの有効性と限界を実証的に示す。</w:t>
+              <w:t>音声強調パイプラインと自動音声認識モデル適応を同一評価指標・同一テストセット上で比較し，喉マイクの自動音声認識における各アプローチの有効性と限界を実証的に示す．</w:t>
             </w:r>
             <w:r>
               <w:rPr>
@@ -1445,7 +1471,7 @@
               <w:rPr>
                 <w:szCs w:val="21"/>
               </w:rPr>
-              <w:t>音声強調による音声品質改善が認識精度向上に直結しない現象をスペクトル分析で機構解明し、喉マイクの物理的特性との関係を明らかにする。</w:t>
+              <w:t>音声強調による音声品質改善が認識精度向上に直結しない現象をスペクトル分析で機構解明し，喉マイクの物理的特性との関係を明らかにする．</w:t>
             </w:r>
             <w:r>
               <w:rPr>
@@ -1457,71 +1483,7 @@
               <w:rPr>
                 <w:szCs w:val="21"/>
               </w:rPr>
-              <w:t>比較・分析から得られる設計原則</w:t>
-            </w:r>
-            <w:r>
-              <w:rPr>
-                <w:szCs w:val="21"/>
-              </w:rPr>
-              <w:t>——</w:t>
-            </w:r>
-            <w:r>
-              <w:rPr>
-                <w:szCs w:val="21"/>
-              </w:rPr>
-              <w:t>ドメイン適合型音声強調よりも</w:t>
-            </w:r>
-            <w:r>
-              <w:rPr>
-                <w:rFonts w:hint="eastAsia"/>
-                <w:szCs w:val="21"/>
-              </w:rPr>
-              <w:t>自動</w:t>
-            </w:r>
-            <w:r>
-              <w:rPr>
-                <w:rFonts w:hint="eastAsia"/>
-                <w:szCs w:val="21"/>
-              </w:rPr>
-              <w:t>音声認識</w:t>
-            </w:r>
-            <w:r>
-              <w:rPr>
-                <w:rFonts w:hint="eastAsia"/>
-                <w:szCs w:val="21"/>
-              </w:rPr>
-              <w:t>における</w:t>
-            </w:r>
-            <w:r>
-              <w:rPr>
-                <w:szCs w:val="21"/>
-              </w:rPr>
-              <w:t>損失</w:t>
-            </w:r>
-            <w:r>
-              <w:rPr>
-                <w:rFonts w:hint="eastAsia"/>
-                <w:szCs w:val="21"/>
-              </w:rPr>
-              <w:t>関数</w:t>
-            </w:r>
-            <w:r>
-              <w:rPr>
-                <w:szCs w:val="21"/>
-              </w:rPr>
-              <w:t>を直接最適化するモデル適応が認識精度改善に有効であるという原則</w:t>
-            </w:r>
-            <w:r>
-              <w:rPr>
-                <w:szCs w:val="21"/>
-              </w:rPr>
-              <w:t>——</w:t>
-            </w:r>
-            <w:r>
-              <w:rPr>
-                <w:szCs w:val="21"/>
-              </w:rPr>
-              <w:t>を明示するとともに、モデル適応のペアデータ依存性という実用化の課題を特定する。</w:t>
+              <w:t>比較・分析から得られる設計原則を明示するとともに，モデル適応のペアデータ依存性という実用化の課題を特定する．</w:t>
             </w:r>
           </w:p>
           <w:p>
@@ -1554,19 +1516,34 @@
               </w:rPr>
             </w:pPr>
             <w:r>
-              <w:t>本研究を通じて、問題設定から実装・評価・論文化まで一貫した研究開発プロセスを経験し、修了後は音声認識・音声処理分野の機械学習エンジニアとして</w:t>
-            </w:r>
-            <w:r>
+              <w:rPr>
+                <w:szCs w:val="21"/>
+              </w:rPr>
+              <w:t>本研究を通じて，問題設定から実装・評価・論文化まで一貫した研究開発プロセスを経験し，修了後は音声認識・音声処理分野の機械学習エンジニアとして</w:t>
+            </w:r>
+            <w:r>
+              <w:rPr>
+                <w:szCs w:val="21"/>
+              </w:rPr>
               <w:t>Tech</w:t>
             </w:r>
             <w:r>
-              <w:t>企業に就職し、軽量適応手法やドメイン適応の知見を音声</w:t>
-            </w:r>
-            <w:r>
+              <w:rPr>
+                <w:szCs w:val="21"/>
+              </w:rPr>
+              <w:t>企業に就職し，軽量適応手法やドメイン適応の知見を音声</w:t>
+            </w:r>
+            <w:r>
+              <w:rPr>
+                <w:szCs w:val="21"/>
+              </w:rPr>
               <w:t>AI</w:t>
             </w:r>
             <w:r>
-              <w:t>製品の開発に活かすことを志望する。将来的には国際的な開発環境での活躍を目指す。</w:t>
+              <w:rPr>
+                <w:szCs w:val="21"/>
+              </w:rPr>
+              <w:t>製品の開発に活かすことを志望する．将来的には国際的な開発環境での活躍を目指す．</w:t>
             </w:r>
           </w:p>
           <w:p>
@@ -1607,7 +1584,10 @@
               </w:rPr>
             </w:pPr>
             <w:r>
-              <w:t>[1] T. Ochiai et al., "Rethinking Processing Distortions," IEEE/ACM TASLP, vol. 32, 2024.</w:t>
+              <w:rPr>
+                <w:szCs w:val="21"/>
+              </w:rPr>
+              <w:t>[1] T. Ochiai et al., “Rethinking processing distortions,” IEEE/ACM TASLP, vol. 32, pp. 4266–4281, 2024.</w:t>
             </w:r>
           </w:p>
           <w:p>
@@ -1619,15 +1599,38 @@
               </w:rPr>
             </w:pPr>
             <w:r>
-              <w:t>[2] C.O. Mawalim et al., "Are Recent DL-Based SE Methods Ready for Real-</w:t>
-            </w:r>
-            <w:proofErr w:type="gramStart"/>
-            <w:r>
-              <w:t>World?,</w:t>
-            </w:r>
-            <w:proofErr w:type="gramEnd"/>
-            <w:r>
-              <w:t>" Proc. Interspeech, 2024.</w:t>
+              <w:rPr>
+                <w:szCs w:val="21"/>
+              </w:rPr>
+              <w:t xml:space="preserve">[2] C.O. </w:t>
+            </w:r>
+            <w:proofErr w:type="spellStart"/>
+            <w:r>
+              <w:rPr>
+                <w:szCs w:val="21"/>
+              </w:rPr>
+              <w:t>Mawalim</w:t>
+            </w:r>
+            <w:proofErr w:type="spellEnd"/>
+            <w:r>
+              <w:rPr>
+                <w:szCs w:val="21"/>
+              </w:rPr>
+              <w:t xml:space="preserve"> et al., “Are recent DL-based SE methods ready for real-world?” Proc. </w:t>
+            </w:r>
+            <w:proofErr w:type="spellStart"/>
+            <w:r>
+              <w:rPr>
+                <w:szCs w:val="21"/>
+              </w:rPr>
+              <w:t>Interspeech</w:t>
+            </w:r>
+            <w:proofErr w:type="spellEnd"/>
+            <w:r>
+              <w:rPr>
+                <w:szCs w:val="21"/>
+              </w:rPr>
+              <w:t>, 2024.</w:t>
             </w:r>
           </w:p>
           <w:p>
@@ -1639,7 +1642,10 @@
               </w:rPr>
             </w:pPr>
             <w:r>
-              <w:t>[3] Y. Kim et al., "TAPS: Throat and Acoustic Paired Speech Dataset for Deep Learning-Based Speech Enhancement," Scientific Data (Nature), 2026.</w:t>
+              <w:rPr>
+                <w:szCs w:val="21"/>
+              </w:rPr>
+              <w:t>[3] Y. Kim et al., “TAPS: Throat and acoustic paired speech dataset for deep learning-based speech enhancement,” Scientific Data (Nature), 2026.</w:t>
             </w:r>
           </w:p>
           <w:p>
@@ -1651,7 +1657,10 @@
               </w:rPr>
             </w:pPr>
             <w:r>
-              <w:t>[4] A. Radford et al., "Robust Speech Recognition via Large-Scale Weak Supervision," Proc. ICML, 2023.</w:t>
+              <w:rPr>
+                <w:szCs w:val="21"/>
+              </w:rPr>
+              <w:t>[4] A. Radford et al., “Robust speech recognition via large-scale weak supervision,” Proc. ICML, 2023.</w:t>
             </w:r>
           </w:p>
           <w:p>
@@ -1663,19 +1672,24 @@
               </w:rPr>
             </w:pPr>
             <w:r>
-              <w:t>[5] N. Houlsby et al., "Parameter-Efficient Transfer Learning for NLP," Proc. ICML, 2019.</w:t>
-            </w:r>
-          </w:p>
-          <w:p>
-            <w:pPr>
-              <w:spacing w:after="20" w:line="276" w:lineRule="auto"/>
-              <w:ind w:left="540" w:hanging="360"/>
-              <w:rPr>
-                <w:szCs w:val="21"/>
-              </w:rPr>
-            </w:pPr>
-            <w:r>
-              <w:t>[6] E.J. Hu et al., "LoRA: Low-Rank Adaptation of Large Language Models," Proc. ICLR, 2022.</w:t>
+              <w:rPr>
+                <w:szCs w:val="21"/>
+              </w:rPr>
+              <w:t xml:space="preserve">[5] N. </w:t>
+            </w:r>
+            <w:proofErr w:type="spellStart"/>
+            <w:r>
+              <w:rPr>
+                <w:szCs w:val="21"/>
+              </w:rPr>
+              <w:t>Houlsby</w:t>
+            </w:r>
+            <w:proofErr w:type="spellEnd"/>
+            <w:r>
+              <w:rPr>
+                <w:szCs w:val="21"/>
+              </w:rPr>
+              <w:t xml:space="preserve"> et al., “Parameter-efficient transfer learning for NLP,” Proc. ICML, 2019.</w:t>
             </w:r>
           </w:p>
         </w:tc>
@@ -1734,14 +1748,14 @@
                         <a:effectLst/>
                         <a:extLst>
                           <a:ext uri="{909E8E84-426E-40dd-AFC4-6F175D3DCCD1}">
-                            <a14:hiddenFill xmlns:a14="http://schemas.microsoft.com/office/drawing/2010/main" xmlns:w="http://schemas.openxmlformats.org/wordprocessingml/2006/main" xmlns:w10="urn:schemas-microsoft-com:office:word" xmlns:v="urn:schemas-microsoft-com:vml" xmlns:o="urn:schemas-microsoft-com:office:office" xmlns:mv="urn:schemas-microsoft-com:mac:vml" xmlns:mo="http://schemas.microsoft.com/office/mac/office/2008/main" xmlns="">
+                            <a14:hiddenFill xmlns="" xmlns:mo="http://schemas.microsoft.com/office/mac/office/2008/main" xmlns:mv="urn:schemas-microsoft-com:mac:vml" xmlns:o="urn:schemas-microsoft-com:office:office" xmlns:v="urn:schemas-microsoft-com:vml" xmlns:w10="urn:schemas-microsoft-com:office:word" xmlns:w="http://schemas.openxmlformats.org/wordprocessingml/2006/main" xmlns:a14="http://schemas.microsoft.com/office/drawing/2010/main">
                               <a:solidFill>
                                 <a:srgbClr val="FFFFFF"/>
                               </a:solidFill>
                             </a14:hiddenFill>
                           </a:ext>
                           <a:ext uri="{91240B29-F687-4f45-9708-019B960494DF}">
-                            <a14:hiddenLine xmlns:a14="http://schemas.microsoft.com/office/drawing/2010/main" xmlns:w="http://schemas.openxmlformats.org/wordprocessingml/2006/main" xmlns:w10="urn:schemas-microsoft-com:office:word" xmlns:v="urn:schemas-microsoft-com:vml" xmlns:o="urn:schemas-microsoft-com:office:office" xmlns:mv="urn:schemas-microsoft-com:mac:vml" xmlns:mo="http://schemas.microsoft.com/office/mac/office/2008/main" xmlns="" w="9525">
+                            <a14:hiddenLine xmlns="" xmlns:mo="http://schemas.microsoft.com/office/mac/office/2008/main" xmlns:mv="urn:schemas-microsoft-com:mac:vml" xmlns:o="urn:schemas-microsoft-com:office:office" xmlns:v="urn:schemas-microsoft-com:vml" xmlns:w10="urn:schemas-microsoft-com:office:word" xmlns:w="http://schemas.openxmlformats.org/wordprocessingml/2006/main" xmlns:a14="http://schemas.microsoft.com/office/drawing/2010/main" w="9525">
                               <a:solidFill>
                                 <a:srgbClr val="000000"/>
                               </a:solidFill>
@@ -1751,7 +1765,7 @@
                             </a14:hiddenLine>
                           </a:ext>
                           <a:ext uri="{AF507438-7753-43e0-B8FC-AC1667EBCBE1}">
-                            <a14:hiddenEffects xmlns:a14="http://schemas.microsoft.com/office/drawing/2010/main" xmlns:w="http://schemas.openxmlformats.org/wordprocessingml/2006/main" xmlns:w10="urn:schemas-microsoft-com:office:word" xmlns:v="urn:schemas-microsoft-com:vml" xmlns:o="urn:schemas-microsoft-com:office:office" xmlns:mv="urn:schemas-microsoft-com:mac:vml" xmlns:mo="http://schemas.microsoft.com/office/mac/office/2008/main" xmlns="">
+                            <a14:hiddenEffects xmlns="" xmlns:mo="http://schemas.microsoft.com/office/mac/office/2008/main" xmlns:mv="urn:schemas-microsoft-com:mac:vml" xmlns:o="urn:schemas-microsoft-com:office:office" xmlns:v="urn:schemas-microsoft-com:vml" xmlns:w10="urn:schemas-microsoft-com:office:word" xmlns:w="http://schemas.openxmlformats.org/wordprocessingml/2006/main" xmlns:a14="http://schemas.microsoft.com/office/drawing/2010/main">
                               <a:effectLst>
                                 <a:outerShdw blurRad="63500" dist="38099" dir="2700000" algn="ctr" rotWithShape="0">
                                   <a:srgbClr val="000000">

</xml_diff>